<commit_message>
Remove Rubric Alignment section from documentation
</commit_message>
<xml_diff>
--- a/ColdCaseVegas_Documentation.docx
+++ b/ColdCaseVegas_Documentation.docx
@@ -3389,400 +3389,6 @@
           <w:color w:val="DC2626"/>
           <w:sz w:val="32"/>
         </w:rPr>
-        <w:t xml:space="preserve">11  </w:t>
-      </w:r>
-      <w:r>
-        <w:rPr>
-          <w:rFonts w:ascii="Calibri" w:hAnsi="Calibri"/>
-          <w:b/>
-          <w:color w:val="0F172A"/>
-          <w:sz w:val="32"/>
-        </w:rPr>
-        <w:t>RUBRIC ALIGNMENT — DIRECT MAPPING</w:t>
-      </w:r>
-    </w:p>
-    <w:tbl>
-      <w:tblPr>
-        <w:tblStyle w:val="TableGrid"/>
-        <w:tblW w:type="auto" w:w="0"/>
-        <w:jc w:val="center"/>
-        <w:tblLook w:firstColumn="1" w:firstRow="1" w:lastColumn="0" w:lastRow="0" w:noHBand="0" w:noVBand="1" w:val="04A0"/>
-      </w:tblPr>
-      <w:tblGrid>
-        <w:gridCol w:w="2880"/>
-        <w:gridCol w:w="2880"/>
-        <w:gridCol w:w="2880"/>
-      </w:tblGrid>
-      <w:tr>
-        <w:tc>
-          <w:tcPr>
-            <w:tcW w:type="dxa" w:w="2880"/>
-            <w:shd w:fill="0F172A"/>
-          </w:tcPr>
-          <w:p>
-            <w:r/>
-            <w:r>
-              <w:rPr>
-                <w:rFonts w:ascii="Calibri" w:hAnsi="Calibri"/>
-                <w:b/>
-                <w:color w:val="FFFFFF"/>
-                <w:sz w:val="20"/>
-              </w:rPr>
-              <w:t>Criterion</w:t>
-            </w:r>
-          </w:p>
-        </w:tc>
-        <w:tc>
-          <w:tcPr>
-            <w:tcW w:type="dxa" w:w="2880"/>
-            <w:shd w:fill="0F172A"/>
-          </w:tcPr>
-          <w:p>
-            <w:r/>
-            <w:r>
-              <w:rPr>
-                <w:rFonts w:ascii="Calibri" w:hAnsi="Calibri"/>
-                <w:b/>
-                <w:color w:val="FFFFFF"/>
-                <w:sz w:val="20"/>
-              </w:rPr>
-              <w:t>Pts</w:t>
-            </w:r>
-          </w:p>
-        </w:tc>
-        <w:tc>
-          <w:tcPr>
-            <w:tcW w:type="dxa" w:w="2880"/>
-            <w:shd w:fill="0F172A"/>
-          </w:tcPr>
-          <w:p>
-            <w:r/>
-            <w:r>
-              <w:rPr>
-                <w:rFonts w:ascii="Calibri" w:hAnsi="Calibri"/>
-                <w:b/>
-                <w:color w:val="FFFFFF"/>
-                <w:sz w:val="20"/>
-              </w:rPr>
-              <w:t>How we address it</w:t>
-            </w:r>
-          </w:p>
-        </w:tc>
-      </w:tr>
-      <w:tr>
-        <w:tc>
-          <w:tcPr>
-            <w:tcW w:type="dxa" w:w="2880"/>
-          </w:tcPr>
-          <w:p>
-            <w:r/>
-            <w:r>
-              <w:rPr>
-                <w:rFonts w:ascii="Calibri" w:hAnsi="Calibri"/>
-                <w:color w:val="1E293B"/>
-                <w:sz w:val="20"/>
-              </w:rPr>
-              <w:t>Problem Statement &amp; Idea</w:t>
-            </w:r>
-          </w:p>
-        </w:tc>
-        <w:tc>
-          <w:tcPr>
-            <w:tcW w:type="dxa" w:w="2880"/>
-          </w:tcPr>
-          <w:p>
-            <w:r/>
-            <w:r>
-              <w:rPr>
-                <w:rFonts w:ascii="Calibri" w:hAnsi="Calibri"/>
-                <w:color w:val="1E293B"/>
-                <w:sz w:val="20"/>
-              </w:rPr>
-              <w:t>20</w:t>
-            </w:r>
-          </w:p>
-        </w:tc>
-        <w:tc>
-          <w:tcPr>
-            <w:tcW w:type="dxa" w:w="2880"/>
-          </w:tcPr>
-          <w:p>
-            <w:r/>
-            <w:r>
-              <w:rPr>
-                <w:rFonts w:ascii="Calibri" w:hAnsi="Calibri"/>
-                <w:color w:val="1E293B"/>
-                <w:sz w:val="20"/>
-              </w:rPr>
-              <w:t>Three original Las Vegas murder cases mapped directly to the Sin City theme. Unique concept — no comparable project exists. Each case has a full narrative, grounded characters, and a non-obvious killer.</w:t>
-            </w:r>
-          </w:p>
-        </w:tc>
-      </w:tr>
-      <w:tr>
-        <w:tc>
-          <w:tcPr>
-            <w:tcW w:type="dxa" w:w="2880"/>
-          </w:tcPr>
-          <w:p>
-            <w:r/>
-            <w:r>
-              <w:rPr>
-                <w:rFonts w:ascii="Calibri" w:hAnsi="Calibri"/>
-                <w:color w:val="1E293B"/>
-                <w:sz w:val="20"/>
-              </w:rPr>
-              <w:t>AI/ML Implementation</w:t>
-            </w:r>
-          </w:p>
-        </w:tc>
-        <w:tc>
-          <w:tcPr>
-            <w:tcW w:type="dxa" w:w="2880"/>
-          </w:tcPr>
-          <w:p>
-            <w:r/>
-            <w:r>
-              <w:rPr>
-                <w:rFonts w:ascii="Calibri" w:hAnsi="Calibri"/>
-                <w:color w:val="1E293B"/>
-                <w:sz w:val="20"/>
-              </w:rPr>
-              <w:t>25</w:t>
-            </w:r>
-          </w:p>
-        </w:tc>
-        <w:tc>
-          <w:tcPr>
-            <w:tcW w:type="dxa" w:w="2880"/>
-          </w:tcPr>
-          <w:p>
-            <w:r/>
-            <w:r>
-              <w:rPr>
-                <w:rFonts w:ascii="Calibri" w:hAnsi="Calibri"/>
-                <w:color w:val="1E293B"/>
-                <w:sz w:val="20"/>
-              </w:rPr>
-              <w:t>Groq Llama 3.1 (8B Instant) across 4 distinct agent types. Prompt engineering per character (9 unique system prompts). Two-call intent classification pipeline. RAG with sentence-transformers embeddings. Suspicion scoring via structured LLM prompt.</w:t>
-            </w:r>
-          </w:p>
-        </w:tc>
-      </w:tr>
-      <w:tr>
-        <w:tc>
-          <w:tcPr>
-            <w:tcW w:type="dxa" w:w="2880"/>
-          </w:tcPr>
-          <w:p>
-            <w:r/>
-            <w:r>
-              <w:rPr>
-                <w:rFonts w:ascii="Calibri" w:hAnsi="Calibri"/>
-                <w:color w:val="1E293B"/>
-                <w:sz w:val="20"/>
-              </w:rPr>
-              <w:t>System Design</w:t>
-              <w:br/>
-              <w:t>(RAG / Agents / Pipelines)</w:t>
-            </w:r>
-          </w:p>
-        </w:tc>
-        <w:tc>
-          <w:tcPr>
-            <w:tcW w:type="dxa" w:w="2880"/>
-          </w:tcPr>
-          <w:p>
-            <w:r/>
-            <w:r>
-              <w:rPr>
-                <w:rFonts w:ascii="Calibri" w:hAnsi="Calibri"/>
-                <w:color w:val="1E293B"/>
-                <w:sz w:val="20"/>
-              </w:rPr>
-              <w:t>15</w:t>
-            </w:r>
-          </w:p>
-        </w:tc>
-        <w:tc>
-          <w:tcPr>
-            <w:tcW w:type="dxa" w:w="2880"/>
-          </w:tcPr>
-          <w:p>
-            <w:r/>
-            <w:r>
-              <w:rPr>
-                <w:rFonts w:ascii="Calibri" w:hAnsi="Calibri"/>
-                <w:color w:val="1E293B"/>
-                <w:sz w:val="20"/>
-              </w:rPr>
-              <w:t>Multi-agent architecture: 3 suspect agents + Detective agent + Intent Classifier + Suspicion Scorer per case. ChromaDB vector database with per-case collections. 9-stage message pipeline. Emotional state machine. Hybrid rule + AI clue detection. Case registry as single source of truth.</w:t>
-            </w:r>
-          </w:p>
-        </w:tc>
-      </w:tr>
-      <w:tr>
-        <w:tc>
-          <w:tcPr>
-            <w:tcW w:type="dxa" w:w="2880"/>
-          </w:tcPr>
-          <w:p>
-            <w:r/>
-            <w:r>
-              <w:rPr>
-                <w:rFonts w:ascii="Calibri" w:hAnsi="Calibri"/>
-                <w:color w:val="1E293B"/>
-                <w:sz w:val="20"/>
-              </w:rPr>
-              <w:t>Code Quality &amp; Structure</w:t>
-            </w:r>
-          </w:p>
-        </w:tc>
-        <w:tc>
-          <w:tcPr>
-            <w:tcW w:type="dxa" w:w="2880"/>
-          </w:tcPr>
-          <w:p>
-            <w:r/>
-            <w:r>
-              <w:rPr>
-                <w:rFonts w:ascii="Calibri" w:hAnsi="Calibri"/>
-                <w:color w:val="1E293B"/>
-                <w:sz w:val="20"/>
-              </w:rPr>
-              <w:t>20</w:t>
-            </w:r>
-          </w:p>
-        </w:tc>
-        <w:tc>
-          <w:tcPr>
-            <w:tcW w:type="dxa" w:w="2880"/>
-          </w:tcPr>
-          <w:p>
-            <w:r/>
-            <w:r>
-              <w:rPr>
-                <w:rFonts w:ascii="Calibri" w:hAnsi="Calibri"/>
-                <w:color w:val="1E293B"/>
-                <w:sz w:val="20"/>
-              </w:rPr>
-              <w:t>Strict separation: one file per agent, one file per prompt, one file per component. Generic suspect_agent.py factory eliminates duplication across 9 suspects. Modular case_registry.py as single source of truth. Frontend components are single-responsibility React components with dedicated CSS.</w:t>
-            </w:r>
-          </w:p>
-        </w:tc>
-      </w:tr>
-      <w:tr>
-        <w:tc>
-          <w:tcPr>
-            <w:tcW w:type="dxa" w:w="2880"/>
-          </w:tcPr>
-          <w:p>
-            <w:r/>
-            <w:r>
-              <w:rPr>
-                <w:rFonts w:ascii="Calibri" w:hAnsi="Calibri"/>
-                <w:color w:val="1E293B"/>
-                <w:sz w:val="20"/>
-              </w:rPr>
-              <w:t>Deployment</w:t>
-            </w:r>
-          </w:p>
-        </w:tc>
-        <w:tc>
-          <w:tcPr>
-            <w:tcW w:type="dxa" w:w="2880"/>
-          </w:tcPr>
-          <w:p>
-            <w:r/>
-            <w:r>
-              <w:rPr>
-                <w:rFonts w:ascii="Calibri" w:hAnsi="Calibri"/>
-                <w:color w:val="1E293B"/>
-                <w:sz w:val="20"/>
-              </w:rPr>
-              <w:t>10</w:t>
-            </w:r>
-          </w:p>
-        </w:tc>
-        <w:tc>
-          <w:tcPr>
-            <w:tcW w:type="dxa" w:w="2880"/>
-          </w:tcPr>
-          <w:p>
-            <w:r/>
-            <w:r>
-              <w:rPr>
-                <w:rFonts w:ascii="Calibri" w:hAnsi="Calibri"/>
-                <w:color w:val="1E293B"/>
-                <w:sz w:val="20"/>
-              </w:rPr>
-              <w:t>Live FastAPI backend + React frontend deployed on Render. Docker multi-stage build. GitHub CI/CD — auto-redeploys on push. Zero local setup required. Accessible from any browser.</w:t>
-            </w:r>
-          </w:p>
-        </w:tc>
-      </w:tr>
-      <w:tr>
-        <w:tc>
-          <w:tcPr>
-            <w:tcW w:type="dxa" w:w="2880"/>
-          </w:tcPr>
-          <w:p>
-            <w:r/>
-            <w:r>
-              <w:rPr>
-                <w:rFonts w:ascii="Calibri" w:hAnsi="Calibri"/>
-                <w:color w:val="1E293B"/>
-                <w:sz w:val="20"/>
-              </w:rPr>
-              <w:t>Bonus Features</w:t>
-            </w:r>
-          </w:p>
-        </w:tc>
-        <w:tc>
-          <w:tcPr>
-            <w:tcW w:type="dxa" w:w="2880"/>
-          </w:tcPr>
-          <w:p>
-            <w:r/>
-            <w:r>
-              <w:rPr>
-                <w:rFonts w:ascii="Calibri" w:hAnsi="Calibri"/>
-                <w:color w:val="1E293B"/>
-                <w:sz w:val="20"/>
-              </w:rPr>
-              <w:t>+</w:t>
-            </w:r>
-          </w:p>
-        </w:tc>
-        <w:tc>
-          <w:tcPr>
-            <w:tcW w:type="dxa" w:w="2880"/>
-          </w:tcPr>
-          <w:p>
-            <w:r/>
-            <w:r>
-              <w:rPr>
-                <w:rFonts w:ascii="Calibri" w:hAnsi="Calibri"/>
-                <w:color w:val="1E293B"/>
-                <w:sz w:val="20"/>
-              </w:rPr>
-              <w:t>Multi-agent system. Real-time WebSocket streaming. Autonomous state machine. Conversation persistence via localStorage. AI-generated verdict narrative. Three independently themed visual identities. Transcript viewer. Session resume.</w:t>
-            </w:r>
-          </w:p>
-        </w:tc>
-      </w:tr>
-    </w:tbl>
-    <w:p>
-      <w:pPr>
-        <w:jc w:val="left"/>
-      </w:pPr>
-      <w:r>
-        <w:rPr>
-          <w:rFonts w:ascii="Calibri" w:hAnsi="Calibri"/>
-          <w:b/>
-          <w:color w:val="DC2626"/>
-          <w:sz w:val="32"/>
-        </w:rPr>
         <w:t xml:space="preserve">12  </w:t>
       </w:r>
       <w:r>

</xml_diff>